<commit_message>
docs: add GitHub Pages redirect and update Milestone 2 report with live demo link
</commit_message>
<xml_diff>
--- a/Temperature_Conversion_System_Milestone_2_Report.docx
+++ b/Temperature_Conversion_System_Milestone_2_Report.docx
@@ -190,6 +190,108 @@
                 <w:sz w:val="20"/>
               </w:rPr>
               <w:t>Prakhar Harne and Naman Shrivastav</w:t>
+            </w:r>
+          </w:p>
+        </w:tc>
+      </w:tr>
+      <w:tr>
+        <w:tc>
+          <w:tcPr>
+            <w:tcW w:type="dxa" w:w="3168"/>
+            <w:shd w:fill="F1F5F9"/>
+            <w:tcMar>
+              <w:top w:w="60" w:type="dxa"/>
+              <w:bottom w:w="60" w:type="dxa"/>
+              <w:left w:w="100" w:type="dxa"/>
+              <w:right w:w="100" w:type="dxa"/>
+            </w:tcMar>
+          </w:tcPr>
+          <w:p>
+            <w:pPr>
+              <w:spacing w:after="0"/>
+            </w:pPr>
+            <w:r>
+              <w:rPr>
+                <w:b/>
+                <w:color w:val="334155"/>
+                <w:sz w:val="20"/>
+              </w:rPr>
+              <w:t>GitHub Repository:</w:t>
+            </w:r>
+          </w:p>
+        </w:tc>
+        <w:tc>
+          <w:tcPr>
+            <w:tcW w:type="dxa" w:w="6192"/>
+            <w:shd w:fill="F8FAFC"/>
+            <w:tcMar>
+              <w:top w:w="60" w:type="dxa"/>
+              <w:bottom w:w="60" w:type="dxa"/>
+              <w:left w:w="100" w:type="dxa"/>
+              <w:right w:w="100" w:type="dxa"/>
+            </w:tcMar>
+          </w:tcPr>
+          <w:p>
+            <w:pPr>
+              <w:spacing w:after="0"/>
+            </w:pPr>
+            <w:r>
+              <w:rPr>
+                <w:color w:val="0F172A"/>
+                <w:sz w:val="20"/>
+              </w:rPr>
+              <w:t>https://github.com/B1tBr34k3r/temperature-conversion-system</w:t>
+            </w:r>
+          </w:p>
+        </w:tc>
+      </w:tr>
+      <w:tr>
+        <w:tc>
+          <w:tcPr>
+            <w:tcW w:type="dxa" w:w="3168"/>
+            <w:shd w:fill="F1F5F9"/>
+            <w:tcMar>
+              <w:top w:w="60" w:type="dxa"/>
+              <w:bottom w:w="60" w:type="dxa"/>
+              <w:left w:w="100" w:type="dxa"/>
+              <w:right w:w="100" w:type="dxa"/>
+            </w:tcMar>
+          </w:tcPr>
+          <w:p>
+            <w:pPr>
+              <w:spacing w:after="0"/>
+            </w:pPr>
+            <w:r>
+              <w:rPr>
+                <w:b/>
+                <w:color w:val="334155"/>
+                <w:sz w:val="20"/>
+              </w:rPr>
+              <w:t>Live Web Prototype:</w:t>
+            </w:r>
+          </w:p>
+        </w:tc>
+        <w:tc>
+          <w:tcPr>
+            <w:tcW w:type="dxa" w:w="6192"/>
+            <w:shd w:fill="F8FAFC"/>
+            <w:tcMar>
+              <w:top w:w="60" w:type="dxa"/>
+              <w:bottom w:w="60" w:type="dxa"/>
+              <w:left w:w="100" w:type="dxa"/>
+              <w:right w:w="100" w:type="dxa"/>
+            </w:tcMar>
+          </w:tcPr>
+          <w:p>
+            <w:pPr>
+              <w:spacing w:after="0"/>
+            </w:pPr>
+            <w:r>
+              <w:rPr>
+                <w:color w:val="0F172A"/>
+                <w:sz w:val="20"/>
+              </w:rPr>
+              <w:t>https://b1tbr34k3r.github.io/temperature-conversion-system/</w:t>
             </w:r>
           </w:p>
         </w:tc>

</xml_diff>

<commit_message>
chore: remove root redirect and delete deployed pages
</commit_message>
<xml_diff>
--- a/Temperature_Conversion_System_Milestone_2_Report.docx
+++ b/Temperature_Conversion_System_Milestone_2_Report.docx
@@ -241,57 +241,6 @@
                 <w:sz w:val="20"/>
               </w:rPr>
               <w:t>https://github.com/B1tBr34k3r/temperature-conversion-system</w:t>
-            </w:r>
-          </w:p>
-        </w:tc>
-      </w:tr>
-      <w:tr>
-        <w:tc>
-          <w:tcPr>
-            <w:tcW w:type="dxa" w:w="3168"/>
-            <w:shd w:fill="F1F5F9"/>
-            <w:tcMar>
-              <w:top w:w="60" w:type="dxa"/>
-              <w:bottom w:w="60" w:type="dxa"/>
-              <w:left w:w="100" w:type="dxa"/>
-              <w:right w:w="100" w:type="dxa"/>
-            </w:tcMar>
-          </w:tcPr>
-          <w:p>
-            <w:pPr>
-              <w:spacing w:after="0"/>
-            </w:pPr>
-            <w:r>
-              <w:rPr>
-                <w:b/>
-                <w:color w:val="334155"/>
-                <w:sz w:val="20"/>
-              </w:rPr>
-              <w:t>Live Web Prototype:</w:t>
-            </w:r>
-          </w:p>
-        </w:tc>
-        <w:tc>
-          <w:tcPr>
-            <w:tcW w:type="dxa" w:w="6192"/>
-            <w:shd w:fill="F8FAFC"/>
-            <w:tcMar>
-              <w:top w:w="60" w:type="dxa"/>
-              <w:bottom w:w="60" w:type="dxa"/>
-              <w:left w:w="100" w:type="dxa"/>
-              <w:right w:w="100" w:type="dxa"/>
-            </w:tcMar>
-          </w:tcPr>
-          <w:p>
-            <w:pPr>
-              <w:spacing w:after="0"/>
-            </w:pPr>
-            <w:r>
-              <w:rPr>
-                <w:color w:val="0F172A"/>
-                <w:sz w:val="20"/>
-              </w:rPr>
-              <w:t>https://b1tbr34k3r.github.io/temperature-conversion-system/</w:t>
             </w:r>
           </w:p>
         </w:tc>

</xml_diff>